<commit_message>
Use 'on hold' instead of 'parked' in client documents and rebuild the change register, discrepancy register and process deck
</commit_message>
<xml_diff>
--- a/docs/deliverables/out/Programme/Change_Management/BIBS_Change_Register_BRD-00_Change_Management_Summary_v1.0.docx
+++ b/docs/deliverables/out/Programme/Change_Management/BIBS_Change_Register_BRD-00_Change_Management_Summary_v1.0.docx
@@ -1751,7 +1751,7 @@
           <w:t xml:space="preserve">	</w:t>
         </w:r>
         <w:r>
-          <w:t xml:space="preserve">9</w:t>
+          <w:t xml:space="preserve">8</w:t>
         </w:r>
       </w:hyperlink>
     </w:p>
@@ -1767,7 +1767,7 @@
           <w:t xml:space="preserve">	</w:t>
         </w:r>
         <w:r>
-          <w:t xml:space="preserve">10</w:t>
+          <w:t xml:space="preserve">9</w:t>
         </w:r>
       </w:hyperlink>
     </w:p>
@@ -1887,7 +1887,7 @@
               <w:rPr>
                 <w:sz w:val="19"/>
               </w:rPr>
-              <w:t>For documentation and change control; does not change the platform build or the FRS baseline. The register records where BIBS differs from the BRDs and what it takes to close each difference. An approved change reaches the FRS only through an FRS revision that cites the CR ID.</w:t>
+              <w:t>For documentation and change control; does not change the platform or the FRS baseline. The register records where BIBS differs from the BRDs and what it takes to close each difference. An approved change reaches the FRS only through an FRS revision that cites the CR ID.</w:t>
             </w:r>
           </w:p>
         </w:tc>
@@ -1901,7 +1901,7 @@
     <w:p>
       <w:r>
         <w:rPr/>
-        <w:t>The BRDs were written before BIBS and, in several places, for the legacy systems (EBIX, QPS, ISYS) that BIBS replaces. The FRS of each BRD records where the built or designed behaviour differs from the BRD text. BDOI's decisions of 26 September 2026 (single go-live, no Employee Benefits portal, documents in S3, reinsurance through Remittance, package remapping at sanitation, January to May 2028 renewals in BIBS, year-end option A) add more. This document and its workbook bring all of these into one master list, so that each deviation is decided once by the Change Control Board (CCB), with its effort known.</w:t>
+        <w:t>The BRDs were written before BIBS and, in several places, for the legacy systems (EBIX, QPS, ISYS) that BIBS replaces. The FRS of each BRD records, in its chapter of proposed business rules and clarifications, where the proposed behaviour differs from the BRD text. BDOI's decisions of 26 September 2026 (single go-live, no Employee Benefits portal, documents in S3, reinsurance through Remittance, package remapping at sanitation, January to May 2028 renewals in BIBS, year-end option A) add more. This document and its workbook bring all of these into one master list, so that each deviation is decided once by the Change Control Board (CCB), with its effort known.</w:t>
       </w:r>
     </w:p>
     <w:p>
@@ -1928,7 +1928,7 @@
       </w:r>
       <w:r>
         <w:rPr/>
-        <w:t xml:space="preserve"> has one row per deviation: 178 change requests (CR-0001 to CR-0178 in the workbook), each with the drop, the BRD and its requirement IDs and pages, the FRS FR IDs, the module, the deviation type, the BRD requirement, the as-built or proposed behaviour, the reason, the business impact, the affected departments, the effort in man-days (Analysis, Build, Test, Documentation), the priority, the CR status, the BDOI decision owner, the register and question references, and the target drop or release.</w:t>
+        <w:t xml:space="preserve"> has one row per deviation: 178 change requests (CR-0001 to CR-0178 in the workbook), each with the drop, the BRD and its requirement IDs and pages, the FRS FR IDs, the deviation type, the BRD requirement, the proposed behaviour, the reason, the business impact, the affected departments, the effort in man-days (Analysis, Development, Test, Documentation), the priority, the CR status, the BDOI decision owner, the register and question references, and the target drop or release.</w:t>
       </w:r>
     </w:p>
     <w:p>
@@ -2422,7 +2422,7 @@
       </w:r>
       <w:r>
         <w:rPr/>
-        <w:t>The FRS of each BRD: "Differences between the built behaviour and the BRD" (FRS BRD-2 and BRD-4 section 1.6, BRD-5 volumes 1 and 2 section 1.7), "Built behaviour that differs from the BRD" (FRS BRD-1 section 10.4), the recorded differences of FRS BRD-7, BRD-8 and BRD-9, the scope exclusions of every FRS and the out-of-scope IDs of FRS BRD-6, and the gaps of the umbrella FRS BRD-00 (section 5).</w:t>
+        <w:t>The FRS of each BRD: the chapter "Proposed business rules and clarifications for confirmation", the scope exclusions of every FRS and the out-of-scope IDs of FRS BRD-6, and chapter 5 of the umbrella FRS BRD-00.</w:t>
       </w:r>
     </w:p>
     <w:p>
@@ -2442,7 +2442,7 @@
       </w:r>
       <w:r>
         <w:rPr/>
-        <w:t>The requirement specs (fit classes CHANGE, NEW and OUT; "Built with parked item" and "Not built" rows of the as-built tables) and the designs (as-built sections and parked lists).</w:t>
+        <w:t>The requirements baselines of the BRDs.</w:t>
       </w:r>
     </w:p>
     <w:p>
@@ -2481,14 +2481,8 @@
         <w:tab/>
       </w:r>
       <w:r>
-        <w:rPr>
-          <w:i/>
-        </w:rPr>
-        <w:t>docs/deliverables/PENDING_EDITS.md</w:t>
-      </w:r>
-      <w:r>
         <w:rPr/>
-        <w:t>, the programme alignment pack (drop and integration mismatches, IER), the architecture option and document storage decisions, and the cross-BRD decisions D1 to D10.</w:t>
+        <w:t>The programme alignment pack (drop and integration mismatches, IER), the architecture option and document storage decisions, and the cross-BRD decisions D1 to D10.</w:t>
       </w:r>
     </w:p>
     <w:p>
@@ -2559,7 +2553,7 @@
       </w:r>
       <w:r>
         <w:rPr/>
-        <w:t>The baseline build of the designed BRDs (Renewal, Employee Benefits, Customer Servicing Facility, Submitted Policies, Data Migration, the rest of Claims): building what the FRS specifies is not a change. Only the delta caused by a deviation is estimated.</w:t>
+        <w:t>The delivery of what the FRS specify (Renewal, Employee Benefits, Customer Servicing Facility, Submitted Policies, Data Migration, Claims) is not a change. Only the delta caused by a deviation is estimated.</w:t>
       </w:r>
     </w:p>
     <w:p>
@@ -2854,7 +2848,7 @@
               <w:rPr>
                 <w:sz w:val="16"/>
               </w:rPr>
-              <w:t>Anyone in BDOI or the project team raises a change request on the CR form, or the project team raises a CR from a recorded deviation (FRS differences, register, alignment pack).</w:t>
+              <w:t>Anyone in BDOI or the project team raises a change request on the CR form, or the project team raises a CR from a recorded deviation (FRS clarifications, register, alignment pack).</w:t>
             </w:r>
           </w:p>
         </w:tc>
@@ -2972,7 +2966,7 @@
               <w:rPr>
                 <w:sz w:val="16"/>
               </w:rPr>
-              <w:t>The business analyst and solution architect assess scope, BRD and FRS references, affected modules, data, interfaces, tests, documents and drop; estimate effort in man-days (Analysis, Build, Test, Documentation).</w:t>
+              <w:t>The business analyst and solution architect assess scope, BRD and FRS references, affected modules, data, interfaces, tests, documents and drop; estimate effort in man-days (Analysis, Development, Test, Documentation).</w:t>
             </w:r>
           </w:p>
         </w:tc>
@@ -3328,7 +3322,7 @@
               <w:rPr>
                 <w:sz w:val="16"/>
               </w:rPr>
-              <w:t>The Project Manager places the CR in a drop or build wave and updates the plan, the FRS change list and the test plan scope.</w:t>
+              <w:t>The Project Manager places the CR in a drop or release and updates the plan, the FRS change list and the test plan scope.</w:t>
             </w:r>
           </w:p>
         </w:tc>
@@ -3446,7 +3440,7 @@
               <w:rPr>
                 <w:sz w:val="16"/>
               </w:rPr>
-              <w:t>The team builds and documents the change: code, configuration, FRS revision, design, test cases, user and configuration guides.</w:t>
+              <w:t>The team delivers and documents the change: configuration, FRS revision, test cases, user and configuration guides.</w:t>
             </w:r>
           </w:p>
         </w:tc>
@@ -3492,7 +3486,7 @@
               <w:rPr>
                 <w:sz w:val="16"/>
               </w:rPr>
-              <w:t>Build, FRS revision, test cases</w:t>
+              <w:t>Delivered change, FRS revision, test cases</w:t>
             </w:r>
           </w:p>
         </w:tc>
@@ -4684,11 +4678,11 @@
         <w:rPr>
           <w:b/>
         </w:rPr>
-        <w:t>Implemented (as built, for acceptance)</w:t>
+        <w:t>For acceptance</w:t>
       </w:r>
       <w:r>
         <w:rPr/>
-        <w:t xml:space="preserve"> - 56 CRs. The behaviour is built (or decided and documented) and differs from the BRD text. No work remains; the CCB records the acceptance, or raises a new CR if it wants the BRD text built instead (the "BRD as written" column gives the indicative effort).</w:t>
+        <w:t xml:space="preserve"> - 56 CRs. The proposed behaviour is decided and documented and differs from the BRD text. No work remains; the CCB records the acceptance, or raises a new CR if it wants the BRD text delivered instead (the "BRD as written" column gives the indicative effort).</w:t>
       </w:r>
     </w:p>
     <w:p>
@@ -4994,7 +4988,7 @@
                 <w:b/>
                 <w:sz w:val="18"/>
               </w:rPr>
-              <w:t>Implemented as built, for acceptance</w:t>
+              <w:t>For acceptance</w:t>
             </w:r>
           </w:p>
         </w:tc>
@@ -5249,7 +5243,7 @@
                 <w:b/>
                 <w:sz w:val="18"/>
               </w:rPr>
-              <w:t>of which Analysis / Build / Test / Documentation</w:t>
+              <w:t>of which Analysis / Development / Test / Documentation</w:t>
             </w:r>
           </w:p>
         </w:tc>
@@ -5286,7 +5280,7 @@
     <w:p>
       <w:r>
         <w:rPr/>
-        <w:t>The 936 man-days are the work still needed to close the deviations as proposed. Not all of it is additional to the BRD scope: part of it (for example the umbrella gaps, the S3 store and the EIAM sign-in) is work the programme needs anyway; the register makes it visible and puts it under change control. Integration dependencies (269 man-days) and items parked pending a BDOI answer (287 man-days) make up 59 percent of the total, so most of the effort is released only by BDOI answers and interface specifications. Drop 1 carries the most effort (422 man-days).</w:t>
+        <w:t>The 936 man-days are the work still needed to close the deviations as proposed. Not all of it is additional to the BRD scope: part of it (for example the umbrella gaps, the S3 store and the EIAM sign-in) is work the programme needs anyway; the register makes it visible and puts it under change control. Integration dependencies (269 man-days) and items deferred pending a BDOI answer (287 man-days) make up 59 percent of the total, so most of the effort is released only by BDOI answers and interface specifications. Drop 1 carries the most effort (422 man-days).</w:t>
       </w:r>
     </w:p>
     <w:p>
@@ -5528,7 +5522,7 @@
                 <w:color w:val="FFFFFF"/>
                 <w:sz w:val="17"/>
               </w:rPr>
-              <w:t>Build</w:t>
+              <w:t>Dev.</w:t>
             </w:r>
           </w:p>
         </w:tc>
@@ -7217,7 +7211,7 @@
                 <w:color w:val="FFFFFF"/>
                 <w:sz w:val="17"/>
               </w:rPr>
-              <w:t>Build</w:t>
+              <w:t>Dev.</w:t>
             </w:r>
           </w:p>
         </w:tc>
@@ -7740,7 +7734,7 @@
                 <w:b/>
                 <w:sz w:val="17"/>
               </w:rPr>
-              <w:t>Behaviour differs from BRD (as built)</w:t>
+              <w:t>Behaviour differs from BRD</w:t>
             </w:r>
           </w:p>
         </w:tc>
@@ -7945,7 +7939,7 @@
                 <w:b/>
                 <w:sz w:val="17"/>
               </w:rPr>
-              <w:t>Deferred / parked pending BDOI answer</w:t>
+              <w:t>Deferred pending BDOI answer</w:t>
             </w:r>
           </w:p>
         </w:tc>
@@ -9611,7 +9605,7 @@
                 <w:color w:val="FFFFFF"/>
                 <w:sz w:val="17"/>
               </w:rPr>
-              <w:t>Build</w:t>
+              <w:t>Dev.</w:t>
             </w:r>
           </w:p>
         </w:tc>
@@ -10134,7 +10128,7 @@
                 <w:b/>
                 <w:sz w:val="17"/>
               </w:rPr>
-              <w:t>Implemented (as built, for acceptance)</w:t>
+              <w:t>For acceptance</w:t>
             </w:r>
           </w:p>
         </w:tc>
@@ -10781,7 +10775,7 @@
                 <w:color w:val="FFFFFF"/>
                 <w:sz w:val="17"/>
               </w:rPr>
-              <w:t>Build</w:t>
+              <w:t>Dev.</w:t>
             </w:r>
           </w:p>
         </w:tc>
@@ -14493,7 +14487,7 @@
                 <w:color w:val="FFFFFF"/>
                 <w:sz w:val="14"/>
               </w:rPr>
-              <w:t>As built / proposed</w:t>
+              <w:t>Proposed</w:t>
             </w:r>
           </w:p>
         </w:tc>
@@ -14665,7 +14659,7 @@
               <w:rPr>
                 <w:sz w:val="14"/>
               </w:rPr>
-              <w:t>Today file bytes sit in PostgreSQL in 13 tables.</w:t>
+              <w:t>Proposed: every file in S3 with its metadata in PostgreSQL.</w:t>
             </w:r>
           </w:p>
         </w:tc>
@@ -14829,7 +14823,7 @@
               <w:rPr>
                 <w:sz w:val="14"/>
               </w:rPr>
-              <w:t>28 schedule definitions and 58 report-pack entries delivered with draft layouts.</w:t>
+              <w:t>28 schedule definitions and 58 report-pack entries with draft layouts.</w:t>
             </w:r>
           </w:p>
         </w:tc>
@@ -15483,7 +15477,7 @@
               <w:rPr>
                 <w:sz w:val="14"/>
               </w:rPr>
-              <w:t>Local sign-in with the DirectoryAuthenticator port (password bind) parked.</w:t>
+              <w:t>BIBS sign-in with user ID and password.</w:t>
             </w:r>
           </w:p>
         </w:tc>
@@ -16137,7 +16131,7 @@
               <w:rPr>
                 <w:sz w:val="14"/>
               </w:rPr>
-              <w:t>Retention rules per record type with review counts are built (default 5 years online, 15 years archive.</w:t>
+              <w:t>Retention rules per record type with review counts (default 5 years online, 15 years archive.</w:t>
             </w:r>
           </w:p>
         </w:tc>
@@ -16464,7 +16458,7 @@
               <w:rPr>
                 <w:sz w:val="14"/>
               </w:rPr>
-              <w:t>Specified, not built, until BDOI confirms the draft addendum.</w:t>
+              <w:t>Proposed in FRS BRD-4 section 4.10 for confirmation of the draft addendum.</w:t>
             </w:r>
           </w:p>
         </w:tc>
@@ -16627,7 +16621,7 @@
               <w:rPr>
                 <w:sz w:val="14"/>
               </w:rPr>
-              <w:t>Kafka integration events (9 topics) and report exports only.</w:t>
+              <w:t>Integration events (9 topics) and report exports.</w:t>
             </w:r>
           </w:p>
         </w:tc>
@@ -16791,7 +16785,7 @@
               <w:rPr>
                 <w:sz w:val="14"/>
               </w:rPr>
-              <w:t>The loader is designed and V1025 is held.</w:t>
+              <w:t>Open claims are migrated only if BDOI puts the object in scope.</w:t>
             </w:r>
           </w:p>
         </w:tc>
@@ -16954,7 +16948,7 @@
               <w:rPr>
                 <w:sz w:val="14"/>
               </w:rPr>
-              <w:t>Built with documented defaults.</w:t>
+              <w:t>Documented defaults apply.</w:t>
             </w:r>
           </w:p>
         </w:tc>
@@ -17445,7 +17439,7 @@
               <w:rPr>
                 <w:sz w:val="14"/>
               </w:rPr>
-              <w:t>Module homes exist for built modules.</w:t>
+              <w:t>Each module has its home page.</w:t>
             </w:r>
           </w:p>
         </w:tc>
@@ -17869,7 +17863,7 @@
     <w:p>
       <w:r>
         <w:rPr/>
-        <w:t>The CRs below cannot be closed without a BDOI decision. The dates are the latest that keep the drop plan: build-shaping items by 16 October 2026 (the date of the programme alignment), the rest before FRS sign-off on 30 November 2026, and the interface specifications by 31 January 2027 for the Drop 2 build.</w:t>
+        <w:t>The CRs below cannot be closed without a BDOI decision. The dates are the latest that keep the drop plan: scope-shaping items by 16 October 2026 (the date of the programme alignment), the rest before FRS sign-off on 30 November 2026, and the interface specifications by 31 January 2027 for Drop 2.</w:t>
       </w:r>
     </w:p>
     <w:p>
@@ -19445,7 +19439,7 @@
               <w:rPr>
                 <w:sz w:val="17"/>
               </w:rPr>
-              <w:t>Analysis of interfaces, data and infrastructure items; design updates</w:t>
+              <w:t>Analysis of interfaces, data and infrastructure items</w:t>
             </w:r>
           </w:p>
         </w:tc>
@@ -19495,7 +19489,7 @@
               <w:rPr>
                 <w:sz w:val="17"/>
               </w:rPr>
-              <w:t>Build: Java services, database migrations, jobs, adapters, reports</w:t>
+              <w:t>Development: services, data changes, jobs, interfaces, reports</w:t>
             </w:r>
           </w:p>
         </w:tc>
@@ -19547,7 +19541,7 @@
               <w:rPr>
                 <w:sz w:val="17"/>
               </w:rPr>
-              <w:t>Build: React screens, forms and lists</w:t>
+              <w:t>Development: screens, forms and lists</w:t>
             </w:r>
           </w:p>
         </w:tc>
@@ -19597,7 +19591,7 @@
               <w:rPr>
                 <w:sz w:val="17"/>
               </w:rPr>
-              <w:t>Test: unit and integration tests reviewed, SIT test cases written and run, regression</w:t>
+              <w:t>Test: SIT test cases written and run, regression</w:t>
             </w:r>
           </w:p>
         </w:tc>
@@ -19649,7 +19643,7 @@
               <w:rPr>
                 <w:sz w:val="17"/>
               </w:rPr>
-              <w:t>Documentation: FRS, design, test plan, user and configuration guides, release notes</w:t>
+              <w:t>Documentation: FRS, test plan, user and configuration guides, release notes</w:t>
             </w:r>
           </w:p>
         </w:tc>
@@ -19697,7 +19691,7 @@
       </w:r>
       <w:r>
         <w:rPr/>
-        <w:t>Effort is the work still needed to close the deviation as proposed in the "As built / proposed" column. It is 0 when the behaviour is built (or decided and documented) and only needs acceptance.</w:t>
+        <w:t>Effort is the work still needed to close the deviation as proposed in the "Proposed behaviour" column. It is 0 when the behaviour is decided and documented and only needs acceptance.</w:t>
       </w:r>
     </w:p>
     <w:p>
@@ -19717,7 +19711,7 @@
       </w:r>
       <w:r>
         <w:rPr/>
-        <w:t>For an item parked pending a BDOI answer, the effort is the work to complete it once BDOI answers as proposed (adapter, values, layouts, screens). A different answer is re-estimated at impact analysis.</w:t>
+        <w:t>For an item deferred pending a BDOI answer, the effort is the work to complete it once BDOI answers as proposed (interface, values, layouts, screens). A different answer is re-estimated at impact analysis.</w:t>
       </w:r>
     </w:p>
     <w:p>
@@ -19737,7 +19731,7 @@
       </w:r>
       <w:r>
         <w:rPr/>
-        <w:t>The optional column "BRD as written" gives the indicative effort to build the BRD text instead of the proposed behaviour, for the CCB to compare.</w:t>
+        <w:t>The optional column "BRD as written" gives the indicative effort to deliver the BRD text instead of the proposed behaviour, for the CCB to compare.</w:t>
       </w:r>
     </w:p>
     <w:p>
@@ -19757,7 +19751,7 @@
       </w:r>
       <w:r>
         <w:rPr/>
-        <w:t>Build includes unit and integration tests written by the developers. Test covers SIT test cases (writing and running) and regression. Documentation covers the FRS, design, test plan and guides.</w:t>
+        <w:t>Development includes configuration. Test covers SIT test cases (writing and running) and regression. Documentation covers the FRS, test plan and guides.</w:t>
       </w:r>
     </w:p>
     <w:p>
@@ -19797,7 +19791,7 @@
       </w:r>
       <w:r>
         <w:rPr/>
-        <w:t>Excluded: the baseline build of the designed BRDs (BRD-6, BRD-8, BRD-9, BRD-12, BRD-13, the rest of BRD-7). Only the delta caused by the deviation is estimated.</w:t>
+        <w:t>Excluded: the delivery of what the FRS specify (BRD-6, BRD-8, BRD-9, BRD-12, BRD-13, BRD-7). Only the delta caused by the deviation is estimated.</w:t>
       </w:r>
     </w:p>
     <w:p>
@@ -19837,7 +19831,7 @@
       </w:r>
       <w:r>
         <w:rPr/>
-        <w:t>Status and counts are as of the date on the cover and are refreshed with the final as-built refresh of the documents.</w:t>
+        <w:t>Status and counts are as of the date on the cover and are refreshed with each issue of the register.</w:t>
       </w:r>
     </w:p>
     <w:p>
@@ -19893,7 +19887,7 @@
       </w:r>
       <w:r>
         <w:rPr/>
-        <w:t xml:space="preserve"> means built, acceptance only. The Register shows the class and the chosen number, for example "L (13)".</w:t>
+        <w:t xml:space="preserve"> means acceptance only. The Register shows the class and the chosen number, for example "L (13)".</w:t>
       </w:r>
     </w:p>
     <w:p>
@@ -19913,7 +19907,7 @@
     <w:p>
       <w:r>
         <w:rPr/>
-        <w:t>By signing, BDOI accepts this register as the list of deviations under change control as of 26 September 2026, the change-control process and the CCB membership proposed in chapter 2. It does not approve any single CR: each CR is decided by the CCB. The FRS baseline and the platform build are not changed by this document.</w:t>
+        <w:t>By signing, BDOI accepts this register as the list of deviations under change control as of 26 September 2026, the change-control process and the CCB membership proposed in chapter 2. It does not approve any single CR: each CR is decided by the CCB. The FRS baseline and the platform are not changed by this document.</w:t>
       </w:r>
     </w:p>
     <w:tbl>

</xml_diff>